<commit_message>
Ficha del inmueble: caracteristicas del edificio en vinetas y seleccion de ejecutivos
- Las caracteristicas del edificio se separan en vinetas: si el texto viene en una sola linea con
  comas se corta por coma, y si ya trae saltos de linea o punto y coma se respetan
- Nuevo bloque 'Ejecutivos comerciales en la ficha' en el paso previo: se eligen hasta 2 y son los
  que figuran como contacto en la portada y en la ultima pagina, con nombre, telefono (si esta
  cargado) y correo; por defecto viene el responsable del inmueble
- Sin seleccion, el contacto sigue cayendo al responsable del edificio como hasta ahora
- Guia del generador actualizada a 1.1

Co-Authored-By: Claude Opus 5 <noreply@anthropic.com>
Claude-Session: https://claude.ai/code/session_01JkU9BrFwXYbLVUvW55gcE9
</commit_message>
<xml_diff>
--- a/docs/manuales/Guia_Ficha_Inmueble.docx
+++ b/docs/manuales/Guia_Ficha_Inmueble.docx
@@ -80,7 +80,7 @@
           <w:color w:val="56648F"/>
           <w:sz w:val="21"/>
         </w:rPr>
-        <w:t>Versión 1.0   ·   08/09/2026</w:t>
+        <w:t>Versión 1.1   ·   08/09/2026</w:t>
       </w:r>
     </w:p>
     <w:p/>
@@ -150,6 +150,39 @@
           <w:color w:val="00285A"/>
           <w:sz w:val="23"/>
         </w:rPr>
+        <w:t>Ejecutivos comerciales en la ficha</w:t>
+      </w:r>
+    </w:p>
+    <w:p>
+      <w:r>
+        <w:rPr>
+          <w:b/>
+          <w:color w:val="1C54F4"/>
+          <w:sz w:val="21"/>
+        </w:rPr>
+        <w:t>Qué ingresar:</w:t>
+      </w:r>
+    </w:p>
+    <w:p>
+      <w:r>
+        <w:t>Qué elegir: quién figura como contacto en la portada y en la última página. Viene marcado el responsable del inmueble (o el usuario logueado) y se pueden elegir hasta 2. Se muestran con su nombre y su correo.</w:t>
+      </w:r>
+    </w:p>
+    <w:p>
+      <w:r>
+        <w:rPr>
+          <w:color w:val="C9D6F0"/>
+        </w:rPr>
+        <w:t>──────────────────────────────────────────────</w:t>
+      </w:r>
+    </w:p>
+    <w:p>
+      <w:r>
+        <w:rPr>
+          <w:b/>
+          <w:color w:val="00285A"/>
+          <w:sz w:val="23"/>
+        </w:rPr>
         <w:t>Características de la oficina (opcional)</w:t>
       </w:r>
     </w:p>
@@ -198,7 +231,7 @@
     </w:p>
     <w:p>
       <w:r>
-        <w:t>El resto sale del inmueble: nombre y dirección (título), descripción (cuerpo de la portada), amenities (características del edificio), superficie disponible, asking rent y el ejecutivo de contacto. Si falta algo, conviene completarlo en la ficha del inmueble antes de generar.</w:t>
+        <w:t>El resto sale del inmueble: nombre y dirección (título), descripción (cuerpo de la portada), amenities (características del edificio), superficie disponible y asking rent. Las características del edificio salen en viñetas: si están escritas en una sola línea separadas por comas, el sistema las separa solo. Si falta algo, conviene completarlo en la ficha del inmueble antes de generar.</w:t>
       </w:r>
     </w:p>
     <w:p>

</xml_diff>

<commit_message>
Ficha del inmueble: logo sin deformar y superficie disponible del piso mas chico al total
- El logo se inserta con sizing contain: mantiene su proporcion dentro del mismo recuadro en vez de
  estirarse (aplica a la ficha y al informe de alternativas, que comparten addLogo)
- Superficie disponible pasa de 'minimo - maximo' a 'minimo - total': con 4 pisos de 986 m² ahora
  muestra 986 - 3.944 m²
- El pie de la pagina de disponibilidad usa el mismo dato y deja de repetir el total

Co-Authored-By: Claude Opus 5 <noreply@anthropic.com>
Claude-Session: https://claude.ai/code/session_01JkU9BrFwXYbLVUvW55gcE9
</commit_message>
<xml_diff>
--- a/docs/manuales/Guia_Ficha_Inmueble.docx
+++ b/docs/manuales/Guia_Ficha_Inmueble.docx
@@ -80,7 +80,7 @@
           <w:color w:val="56648F"/>
           <w:sz w:val="21"/>
         </w:rPr>
-        <w:t>Versión 1.1   ·   08/09/2026</w:t>
+        <w:t>Versión 1.2   ·   08/09/2026</w:t>
       </w:r>
     </w:p>
     <w:p/>
@@ -231,7 +231,7 @@
     </w:p>
     <w:p>
       <w:r>
-        <w:t>El resto sale del inmueble: nombre y dirección (título), descripción (cuerpo de la portada), amenities (características del edificio), superficie disponible y asking rent. Las características del edificio salen en viñetas: si están escritas en una sola línea separadas por comas, el sistema las separa solo. Si falta algo, conviene completarlo en la ficha del inmueble antes de generar.</w:t>
+        <w:t>El resto sale del inmueble: nombre y dirección (título), descripción (cuerpo de la portada), amenities (características del edificio), superficie disponible (del piso más chico al total disponible, por ejemplo 986 – 3.944 m²) y asking rent. Las características del edificio salen en viñetas: si están escritas en una sola línea separadas por comas, el sistema las separa solo. Si falta algo, conviene completarlo en la ficha del inmueble antes de generar.</w:t>
       </w:r>
     </w:p>
     <w:p>

</xml_diff>